<commit_message>
guide MAR v0.4 : section Sources en fin de document
</commit_message>
<xml_diff>
--- a/docs/module-liberal/guide_liberal_MAR.docx
+++ b/docs/module-liberal/guide_liberal_MAR.docx
@@ -57,7 +57,7 @@
           <w:sz w:val="18"/>
           <w:szCs w:val="18"/>
         </w:rPr>
-        <w:t xml:space="preserve">v0.3 · 19 juillet 2026 · document de travail — texte commun aux versions web et Word</w:t>
+        <w:t xml:space="preserve">v0.4 · 19 juillet 2026 · document de travail — texte commun aux versions web et Word</w:t>
       </w:r>
     </w:p>
     <w:p>
@@ -3446,6 +3446,198 @@
           <w:color w:val="0F172A"/>
         </w:rPr>
         <w:t xml:space="preserve">la ligne d'anesthésie et la consultation sont-elles bien parties ?</w:t>
+      </w:r>
+    </w:p>
+    <w:p>
+      <w:pPr>
+        <w:spacing w:after="120"/>
+      </w:pPr>
+    </w:p>
+    <w:p>
+      <w:pPr>
+        <w:pStyle w:val="Heading1"/>
+        <w:pBdr>
+          <w:bottom w:val="single" w:color="6D28D9" w:sz="6" w:space="6"/>
+        </w:pBdr>
+        <w:spacing w:after="180" w:before="420"/>
+      </w:pPr>
+      <w:r>
+        <w:rPr>
+          <w:color w:val="0F172A"/>
+        </w:rPr>
+        <w:t xml:space="preserve">Sources</w:t>
+      </w:r>
+    </w:p>
+    <w:p>
+      <w:pPr>
+        <w:pStyle w:val="ListParagraph"/>
+        <w:numPr>
+          <w:ilvl w:val="0"/>
+          <w:numId w:val="2"/>
+        </w:numPr>
+        <w:spacing w:after="100" w:line="276"/>
+      </w:pPr>
+      <w:r>
+        <w:rPr>
+          <w:b/>
+          <w:bCs/>
+          <w:color w:val="0F172A"/>
+        </w:rPr>
+        <w:t xml:space="preserve">Convention CCSS-CAMTI / Ordre des Médecins de Monaco</w:t>
+      </w:r>
+      <w:r>
+        <w:rPr>
+          <w:b w:val="false"/>
+          <w:bCs w:val="false"/>
+          <w:color w:val="0F172A"/>
+        </w:rPr>
+        <w:t xml:space="preserve"> du 1er avril 2023 (en vigueur jusqu'au 31/03/2028) et son addendum tarifaire du 02/09/2025, à effet du 01/10/2025 — caisses-sociales.mc.</w:t>
+      </w:r>
+    </w:p>
+    <w:p>
+      <w:pPr>
+        <w:pStyle w:val="ListParagraph"/>
+        <w:numPr>
+          <w:ilvl w:val="0"/>
+          <w:numId w:val="2"/>
+        </w:numPr>
+        <w:spacing w:after="100" w:line="276"/>
+      </w:pPr>
+      <w:r>
+        <w:rPr>
+          <w:b/>
+          <w:bCs/>
+          <w:color w:val="0F172A"/>
+        </w:rPr>
+        <w:t xml:space="preserve">Arrêté Ministériel n° 2005-276</w:t>
+      </w:r>
+      <w:r>
+        <w:rPr>
+          <w:b w:val="false"/>
+          <w:bCs w:val="false"/>
+          <w:color w:val="0F172A"/>
+        </w:rPr>
+        <w:t xml:space="preserve"> (CCAM monégasque) et </w:t>
+      </w:r>
+      <w:r>
+        <w:rPr>
+          <w:b/>
+          <w:bCs/>
+          <w:color w:val="0F172A"/>
+        </w:rPr>
+        <w:t xml:space="preserve">Arrêté Ministériel n° 84-688</w:t>
+      </w:r>
+      <w:r>
+        <w:rPr>
+          <w:b w:val="false"/>
+          <w:bCs w:val="false"/>
+          <w:color w:val="0F172A"/>
+        </w:rPr>
+        <w:t xml:space="preserve"> (NGAP monégasque).</w:t>
+      </w:r>
+    </w:p>
+    <w:p>
+      <w:pPr>
+        <w:pStyle w:val="ListParagraph"/>
+        <w:numPr>
+          <w:ilvl w:val="0"/>
+          <w:numId w:val="2"/>
+        </w:numPr>
+        <w:spacing w:after="100" w:line="276"/>
+      </w:pPr>
+      <w:r>
+        <w:rPr>
+          <w:b/>
+          <w:bCs/>
+          <w:color w:val="0F172A"/>
+        </w:rPr>
+        <w:t xml:space="preserve">Ordonnance souveraine n° 5.743 du 03/03/2016</w:t>
+      </w:r>
+      <w:r>
+        <w:rPr>
+          <w:b w:val="false"/>
+          <w:bCs w:val="false"/>
+          <w:color w:val="0F172A"/>
+        </w:rPr>
+        <w:t xml:space="preserve"> (AME monégasque).</w:t>
+      </w:r>
+    </w:p>
+    <w:p>
+      <w:pPr>
+        <w:pStyle w:val="ListParagraph"/>
+        <w:numPr>
+          <w:ilvl w:val="0"/>
+          <w:numId w:val="2"/>
+        </w:numPr>
+        <w:spacing w:after="100" w:line="276"/>
+      </w:pPr>
+      <w:r>
+        <w:rPr>
+          <w:b/>
+          <w:bCs/>
+          <w:color w:val="0F172A"/>
+        </w:rPr>
+        <w:t xml:space="preserve">NGAP française, art. 18B</w:t>
+      </w:r>
+      <w:r>
+        <w:rPr>
+          <w:b w:val="false"/>
+          <w:bCs w:val="false"/>
+          <w:color w:val="0F172A"/>
+        </w:rPr>
+        <w:t xml:space="preserve"> (avis ponctuel de consultant) et convention médicale 2024-2026 — dérogation APC pour la consultation pré-anesthésique d'un patient ASA ≥ 3 ; transposition monégasque à confirmer.</w:t>
+      </w:r>
+    </w:p>
+    <w:p>
+      <w:pPr>
+        <w:pStyle w:val="ListParagraph"/>
+        <w:numPr>
+          <w:ilvl w:val="0"/>
+          <w:numId w:val="2"/>
+        </w:numPr>
+        <w:spacing w:after="100" w:line="276"/>
+      </w:pPr>
+      <w:r>
+        <w:rPr>
+          <w:b/>
+          <w:bCs/>
+          <w:color w:val="0F172A"/>
+        </w:rPr>
+        <w:t xml:space="preserve">Relevés administratifs mensuels du groupement</w:t>
+      </w:r>
+      <w:r>
+        <w:rPr>
+          <w:b w:val="false"/>
+          <w:bCs w:val="false"/>
+          <w:color w:val="0F172A"/>
+        </w:rPr>
+        <w:t xml:space="preserve"> (janvier–juin 2026), validés au centime.</w:t>
+      </w:r>
+    </w:p>
+    <w:p>
+      <w:pPr>
+        <w:pStyle w:val="ListParagraph"/>
+        <w:numPr>
+          <w:ilvl w:val="0"/>
+          <w:numId w:val="2"/>
+        </w:numPr>
+        <w:spacing w:after="100" w:line="276"/>
+      </w:pPr>
+      <w:r>
+        <w:rPr>
+          <w:b/>
+          <w:bCs/>
+          <w:color w:val="0F172A"/>
+        </w:rPr>
+        <w:t xml:space="preserve">Documents internes</w:t>
+      </w:r>
+      <w:r>
+        <w:rPr>
+          <w:b w:val="false"/>
+          <w:bCs w:val="false"/>
+          <w:color w:val="0F172A"/>
+        </w:rPr>
+        <w:t xml:space="preserve"> — antisèche de cotation et guide d'aide au codage, dossier module-liberal du portail. En cas de divergence, la convention et ses addenda font foi.</w:t>
       </w:r>
     </w:p>
     <w:p>

</xml_diff>

<commit_message>
guide MAR v0.5 : consentement patient (declaration de choix nominative), estimation de frais hospitalisation, base legale OS 7.766, sources CHPG
</commit_message>
<xml_diff>
--- a/docs/module-liberal/guide_liberal_MAR.docx
+++ b/docs/module-liberal/guide_liberal_MAR.docx
@@ -57,7 +57,7 @@
           <w:sz w:val="18"/>
           <w:szCs w:val="18"/>
         </w:rPr>
-        <w:t xml:space="preserve">v0.4 · 19 juillet 2026 · document de travail — texte commun aux versions web et Word</w:t>
+        <w:t xml:space="preserve">v0.5 · 19 juillet 2026 · document de travail — texte commun aux versions web et Word</w:t>
       </w:r>
     </w:p>
     <w:p>
@@ -164,6 +164,153 @@
           <w:color w:val="0F172A"/>
         </w:rPr>
         <w:t xml:space="preserve">1. Le reste à charge du patient</w:t>
+      </w:r>
+    </w:p>
+    <w:p>
+      <w:pPr>
+        <w:pStyle w:val="Heading2"/>
+        <w:spacing w:after="140" w:before="300"/>
+      </w:pPr>
+      <w:r>
+        <w:rPr>
+          <w:color w:val="4C1D95"/>
+        </w:rPr>
+        <w:t xml:space="preserve">Avant tout : le choix écrit du patient</w:t>
+      </w:r>
+    </w:p>
+    <w:p>
+      <w:pPr>
+        <w:spacing w:after="160" w:line="288"/>
+      </w:pPr>
+      <w:r>
+        <w:rPr>
+          <w:b w:val="false"/>
+          <w:bCs w:val="false"/>
+          <w:color w:val="0F172A"/>
+        </w:rPr>
+        <w:t xml:space="preserve">Un patient n'est jamais « en libéral » par défaut : l'admission au CHPG se fait en secteur public, et c'est le patient qui choisit, par écrit, d'être pris en charge au titre de l'activité libérale d'un praticien. Ce choix passe par la </w:t>
+      </w:r>
+      <w:r>
+        <w:rPr>
+          <w:b/>
+          <w:bCs/>
+          <w:color w:val="0F172A"/>
+        </w:rPr>
+        <w:t xml:space="preserve">déclaration de choix de prise en charge à titre libéral</w:t>
+      </w:r>
+      <w:r>
+        <w:rPr>
+          <w:b w:val="false"/>
+          <w:bCs w:val="false"/>
+          <w:color w:val="0F172A"/>
+        </w:rPr>
+        <w:t xml:space="preserve"> — et elle est </w:t>
+      </w:r>
+      <w:r>
+        <w:rPr>
+          <w:b/>
+          <w:bCs/>
+          <w:color w:val="0F172A"/>
+        </w:rPr>
+        <w:t xml:space="preserve">nominative : un imprimé par praticien</w:t>
+      </w:r>
+      <w:r>
+        <w:rPr>
+          <w:b w:val="false"/>
+          <w:bCs w:val="false"/>
+          <w:color w:val="0F172A"/>
+        </w:rPr>
+        <w:t xml:space="preserve">, signé par le patient </w:t>
+      </w:r>
+      <w:r>
+        <w:rPr>
+          <w:b/>
+          <w:bCs/>
+          <w:color w:val="0F172A"/>
+        </w:rPr>
+        <w:t xml:space="preserve">et</w:t>
+      </w:r>
+      <w:r>
+        <w:rPr>
+          <w:b w:val="false"/>
+          <w:bCs w:val="false"/>
+          <w:color w:val="0F172A"/>
+        </w:rPr>
+        <w:t xml:space="preserve"> par le praticien, chacun en présence de l'autre.</w:t>
+      </w:r>
+    </w:p>
+    <w:p>
+      <w:pPr>
+        <w:spacing w:after="160" w:line="288"/>
+      </w:pPr>
+      <w:r>
+        <w:rPr>
+          <w:b w:val="false"/>
+          <w:bCs w:val="false"/>
+          <w:color w:val="0F172A"/>
+        </w:rPr>
+        <w:t xml:space="preserve">Pour un parcours d'anesthésie libéral, cela signifie que le patient signe une déclaration </w:t>
+      </w:r>
+      <w:r>
+        <w:rPr>
+          <w:b/>
+          <w:bCs/>
+          <w:color w:val="0F172A"/>
+        </w:rPr>
+        <w:t xml:space="preserve">désignant le MAR nommément</w:t>
+      </w:r>
+      <w:r>
+        <w:rPr>
+          <w:b w:val="false"/>
+          <w:bCs w:val="false"/>
+          <w:color w:val="0F172A"/>
+        </w:rPr>
+        <w:t xml:space="preserve"> — celle signée pour le chirurgien ne couvre pas l'anesthésiste. Sans ce document dans le dossier, le patient est réputé avoir choisi le public : les honoraires libéraux facturés sont alors récupérables par la Caisse (procédure d'indu), et en cas de contestation la prise en charge est rebasculée en public si la preuve signée ne figure pas dans le DPI. Le moment naturel pour la faire signer : la consultation pré-anesthésique.</w:t>
+      </w:r>
+    </w:p>
+    <w:p>
+      <w:pPr>
+        <w:spacing w:after="160" w:line="288"/>
+      </w:pPr>
+      <w:r>
+        <w:rPr>
+          <w:b w:val="false"/>
+          <w:bCs w:val="false"/>
+          <w:color w:val="0F172A"/>
+        </w:rPr>
+        <w:t xml:space="preserve">Deux exclusions à connaître : </w:t>
+      </w:r>
+      <w:r>
+        <w:rPr>
+          <w:b/>
+          <w:bCs/>
+          <w:color w:val="0F172A"/>
+        </w:rPr>
+        <w:t xml:space="preserve">pas de prise en charge libérale après une admission en urgence</w:t>
+      </w:r>
+      <w:r>
+        <w:rPr>
+          <w:b w:val="false"/>
+          <w:bCs w:val="false"/>
+          <w:color w:val="0F172A"/>
+        </w:rPr>
+        <w:t xml:space="preserve">, ni pour les </w:t>
+      </w:r>
+      <w:r>
+        <w:rPr>
+          <w:b/>
+          <w:bCs/>
+          <w:color w:val="0F172A"/>
+        </w:rPr>
+        <w:t xml:space="preserve">personnels et retraités du CHPG</w:t>
+      </w:r>
+      <w:r>
+        <w:rPr>
+          <w:b w:val="false"/>
+          <w:bCs w:val="false"/>
+          <w:color w:val="0F172A"/>
+        </w:rPr>
+        <w:t xml:space="preserve">.</w:t>
       </w:r>
     </w:p>
     <w:p>
@@ -1312,7 +1459,39 @@
           <w:bCs w:val="false"/>
           <w:color w:val="0F172A"/>
         </w:rPr>
-        <w:t xml:space="preserve">Dès qu'un dépassement dépasse </w:t>
+        <w:t xml:space="preserve">Le CHPG l'exige par écrit : en cas de prise en charge libérale </w:t>
+      </w:r>
+      <w:r>
+        <w:rPr>
+          <w:b/>
+          <w:bCs/>
+          <w:color w:val="0F172A"/>
+        </w:rPr>
+        <w:t xml:space="preserve">en hospitalisation</w:t>
+      </w:r>
+      <w:r>
+        <w:rPr>
+          <w:b w:val="false"/>
+          <w:bCs w:val="false"/>
+          <w:color w:val="0F172A"/>
+        </w:rPr>
+        <w:t xml:space="preserve"> avec dépassement, une </w:t>
+      </w:r>
+      <w:r>
+        <w:rPr>
+          <w:b/>
+          <w:bCs/>
+          <w:color w:val="0F172A"/>
+        </w:rPr>
+        <w:t xml:space="preserve">estimation de frais réalisée par le praticien est systématiquement remise</w:t>
+      </w:r>
+      <w:r>
+        <w:rPr>
+          <w:b w:val="false"/>
+          <w:bCs w:val="false"/>
+          <w:color w:val="0F172A"/>
+        </w:rPr>
+        <w:t xml:space="preserve"> au patient (règlement intérieur ENR/QUA/1086/001). Plus généralement, dès qu'un dépassement dépasse </w:t>
       </w:r>
       <w:r>
         <w:rPr>
@@ -1965,7 +2144,23 @@
           <w:bCs w:val="false"/>
           <w:color w:val="0F172A"/>
         </w:rPr>
-        <w:t xml:space="preserve">. C'est une règle administrative, pas une décision du service.</w:t>
+        <w:t xml:space="preserve">. Ce n'est pas une décision du service : c'est un texte — l'Ordonnance Souveraine n° 7.766 du 6 novembre 2019, qui précise aussi que le contrôle s'opère </w:t>
+      </w:r>
+      <w:r>
+        <w:rPr>
+          <w:b/>
+          <w:bCs/>
+          <w:color w:val="0F172A"/>
+        </w:rPr>
+        <w:t xml:space="preserve">par catégorie d'actes</w:t>
+      </w:r>
+      <w:r>
+        <w:rPr>
+          <w:b w:val="false"/>
+          <w:bCs w:val="false"/>
+          <w:color w:val="0F172A"/>
+        </w:rPr>
+        <w:t xml:space="preserve">, et non plus globalement.</w:t>
       </w:r>
     </w:p>
     <w:p>
@@ -3492,6 +3687,74 @@
           <w:color w:val="0F172A"/>
         </w:rPr>
         <w:t xml:space="preserve"> du 1er avril 2023 (en vigueur jusqu'au 31/03/2028) et son addendum tarifaire du 02/09/2025, à effet du 01/10/2025 — caisses-sociales.mc.</w:t>
+      </w:r>
+    </w:p>
+    <w:p>
+      <w:pPr>
+        <w:pStyle w:val="ListParagraph"/>
+        <w:numPr>
+          <w:ilvl w:val="0"/>
+          <w:numId w:val="2"/>
+        </w:numPr>
+        <w:spacing w:after="100" w:line="276"/>
+      </w:pPr>
+      <w:r>
+        <w:rPr>
+          <w:b/>
+          <w:bCs/>
+          <w:color w:val="0F172A"/>
+        </w:rPr>
+        <w:t xml:space="preserve">Ordonnance Souveraine n° 13.839 du 29/12/1998 modifiée</w:t>
+      </w:r>
+      <w:r>
+        <w:rPr>
+          <w:b w:val="false"/>
+          <w:bCs w:val="false"/>
+          <w:color w:val="0F172A"/>
+        </w:rPr>
+        <w:t xml:space="preserve"> (statut des praticiens, activité libérale au CHPG) et </w:t>
+      </w:r>
+      <w:r>
+        <w:rPr>
+          <w:b/>
+          <w:bCs/>
+          <w:color w:val="0F172A"/>
+        </w:rPr>
+        <w:t xml:space="preserve">OS n° 7.766 du 06/11/2019</w:t>
+      </w:r>
+      <w:r>
+        <w:rPr>
+          <w:b w:val="false"/>
+          <w:bCs w:val="false"/>
+          <w:color w:val="0F172A"/>
+        </w:rPr>
+        <w:t xml:space="preserve"> (contrôle du 30 % par catégorie d'actes) ; A.M. n° 98-631 et A.M. n° 2000-295.</w:t>
+      </w:r>
+    </w:p>
+    <w:p>
+      <w:pPr>
+        <w:pStyle w:val="ListParagraph"/>
+        <w:numPr>
+          <w:ilvl w:val="0"/>
+          <w:numId w:val="2"/>
+        </w:numPr>
+        <w:spacing w:after="100" w:line="276"/>
+      </w:pPr>
+      <w:r>
+        <w:rPr>
+          <w:b/>
+          <w:bCs/>
+          <w:color w:val="0F172A"/>
+        </w:rPr>
+        <w:t xml:space="preserve">Documents CHPG</w:t>
+      </w:r>
+      <w:r>
+        <w:rPr>
+          <w:b w:val="false"/>
+          <w:bCs w:val="false"/>
+          <w:color w:val="0F172A"/>
+        </w:rPr>
+        <w:t xml:space="preserve"> : protocole de gestion de l'activité libérale (DAM), règlement « Réglementation et respect des bonnes pratiques » ENR/QUA/1086/001 (26/03/2026), note d'information DAM.</w:t>
       </w:r>
     </w:p>
     <w:p>

</xml_diff>